<commit_message>
feat: zoom battles and strengthen classic frontiers
</commit_message>
<xml_diff>
--- a/docs/CURRENT_GAME_DESIGN.docx
+++ b/docs/CURRENT_GAME_DESIGN.docx
@@ -16,10 +16,7 @@
     </w:p>
     <w:p>
       <w:r>
-        <w:rPr>
-          <w:rFonts w:ascii="Microsoft YaHei" w:hAnsi="Microsoft YaHei" w:eastAsia="Microsoft YaHei"/>
-        </w:rPr>
-        <w:t>更新日期：2026-07-14</w:t>
+        <w:t>更新日期：2026-08-12</w:t>
       </w:r>
     </w:p>
     <w:p>
@@ -25210,6 +25207,86 @@
           <w:rFonts w:ascii="Microsoft YaHei" w:hAnsi="Microsoft YaHei" w:eastAsia="Microsoft YaHei"/>
         </w:rPr>
         <w:t>编组页测试卡牌替换、页签切换、滚动和锁定按钮提示。</w:t>
+      </w:r>
+    </w:p>
+    <w:p>
+      <w:pPr>
+        <w:pStyle w:val="Heading1"/>
+      </w:pPr>
+      <w:r>
+        <w:t>14. 2026-08-12 制作人调整</w:t>
+      </w:r>
+    </w:p>
+    <w:p>
+      <w:pPr>
+        <w:pStyle w:val="Heading2"/>
+      </w:pPr>
+      <w:r>
+        <w:t>14.1 默认镜头与经典地图战线</w:t>
+      </w:r>
+    </w:p>
+    <w:p>
+      <w:pPr>
+        <w:pStyle w:val="ListBullet"/>
+      </w:pPr>
+      <w:r>
+        <w:t>所有轴向六边形战斗棋盘的默认视觉镜头倍率固定为 1.30，即相对原始 1.00 拉近 30%。地块、动物和建筑使用同一镜头投影；HUD 与底部信息区保持原尺寸。</w:t>
+      </w:r>
+    </w:p>
+    <w:p>
+      <w:pPr>
+        <w:pStyle w:val="ListBullet"/>
+      </w:pPr>
+      <w:r>
+        <w:t>镜头倍率只影响世界坐标到屏幕坐标的绘制、命中反算、拖动边界与可视范围，不得改变移动速度、攻击距离、碰撞、寻路、地块邻接或服务器战斗状态。</w:t>
+      </w:r>
+    </w:p>
+    <w:p>
+      <w:pPr>
+        <w:pStyle w:val="ListBullet"/>
+      </w:pPr>
+      <w:r>
+        <w:t>经典单人和段位 AI 使用的全部 5 张 1V1 地图必须执行独立战线优化：双方预归属格数相等且各自连通，双方直接相邻的公共六边格边不少于 9 条，并至少保留 1 格中立争夺格。</w:t>
+      </w:r>
+    </w:p>
+    <w:p>
+      <w:pPr>
+        <w:pStyle w:val="ListBullet"/>
+      </w:pPr>
+      <w:r>
+        <w:t>经典战线优化后双方各 37 格；双方新增战线格复制同一站点与价格模板，到各自基地的六边格距离差不超过 2，并按对局种子交替分配。多人房间、六人自由混战与 MultiplayerRules.create_match() 的多人生成结果不得被此优化修改。</w:t>
+      </w:r>
+    </w:p>
+    <w:p>
+      <w:pPr>
+        <w:pStyle w:val="Heading2"/>
+      </w:pPr>
+      <w:r>
+        <w:t>14.2 账号密码登录与手机包</w:t>
+      </w:r>
+    </w:p>
+    <w:p>
+      <w:pPr>
+        <w:pStyle w:val="ListBullet"/>
+      </w:pPr>
+      <w:r>
+        <w:t>账号中心必须提供用户名和密码的注册、登录入口；用户名不区分大小写，长度 3–32，密码长度 8–72。密码不得明文落盘或进入日志。</w:t>
+      </w:r>
+    </w:p>
+    <w:p>
+      <w:pPr>
+        <w:pStyle w:val="ListBullet"/>
+      </w:pPr>
+      <w:r>
+        <w:t>登录成功后由服务器签发会话并绑定当前安装凭据，后续启动自动恢复同一账号；卡牌、等级、卡组、抽卡券、段位和镜像资料以服务器档案为权威。</w:t>
+      </w:r>
+    </w:p>
+    <w:p>
+      <w:pPr>
+        <w:pStyle w:val="ListBullet"/>
+      </w:pPr>
+      <w:r>
+        <w:t>错误账号或密码统一返回不泄露账户存在性的失败提示。手机包必须保持竖屏、具备 Internet 权限，并使用项目批准的云服务器地址；本地服务不作为发布验收。</w:t>
       </w:r>
     </w:p>
     <w:sectPr>

</xml_diff>

<commit_message>
feat(display): standardize 720p game resolutions
</commit_message>
<xml_diff>
--- a/docs/CURRENT_GAME_DESIGN.docx
+++ b/docs/CURRENT_GAME_DESIGN.docx
@@ -16,7 +16,7 @@
     </w:p>
     <w:p>
       <w:r>
-        <w:t>更新日期：2026-08-12</w:t>
+        <w:t>更新日期：2026-08-25</w:t>
       </w:r>
     </w:p>
     <w:p>
@@ -2334,13 +2334,13 @@
                 <w:rFonts w:ascii="Microsoft YaHei" w:hAnsi="Microsoft YaHei" w:eastAsia="Microsoft YaHei"/>
                 <w:sz w:val="18"/>
               </w:rPr>
-            </w:r>
-            <w:r>
-              <w:rPr>
-                <w:rFonts w:ascii="Microsoft YaHei" w:hAnsi="Microsoft YaHei" w:eastAsia="Microsoft YaHei"/>
-                <w:sz w:val="18"/>
-              </w:rPr>
-              <w:t>设计分辨率</w:t>
+              <w:t>竖屏设计分辨率</w:t>
+            </w:r>
+            <w:r>
+              <w:rPr>
+                <w:rFonts w:ascii="Microsoft YaHei" w:hAnsi="Microsoft YaHei" w:eastAsia="Microsoft YaHei"/>
+                <w:sz w:val="18"/>
+              </w:rPr>
             </w:r>
           </w:p>
         </w:tc>
@@ -2364,14 +2364,14 @@
                 <w:rFonts w:ascii="Microsoft YaHei" w:hAnsi="Microsoft YaHei" w:eastAsia="Microsoft YaHei"/>
                 <w:sz w:val="18"/>
               </w:rPr>
-            </w:r>
-            <w:r>
-              <w:rPr>
-                <w:rFonts w:ascii="Microsoft YaHei" w:hAnsi="Microsoft YaHei" w:eastAsia="Microsoft YaHei"/>
-                <w:sz w:val="18"/>
-              </w:rPr>
               <w:t>720x1280</w:t>
             </w:r>
+            <w:r>
+              <w:rPr>
+                <w:rFonts w:ascii="Microsoft YaHei" w:hAnsi="Microsoft YaHei" w:eastAsia="Microsoft YaHei"/>
+                <w:sz w:val="18"/>
+              </w:rPr>
+            </w:r>
           </w:p>
         </w:tc>
         <w:tc>
@@ -2394,6 +2394,7 @@
                 <w:rFonts w:ascii="Microsoft YaHei" w:hAnsi="Microsoft YaHei" w:eastAsia="Microsoft YaHei"/>
                 <w:sz w:val="18"/>
               </w:rPr>
+              <w:t>scripts/app/main.gd</w:t>
             </w:r>
             <w:r>
               <w:rPr>
@@ -2401,7 +2402,6 @@
                 <w:color w:val="1F4D78"/>
                 <w:sz w:val="18"/>
               </w:rPr>
-              <w:t>scripts/app/main.gd</w:t>
             </w:r>
           </w:p>
         </w:tc>
@@ -2430,13 +2430,13 @@
                 <w:rFonts w:ascii="Microsoft YaHei" w:hAnsi="Microsoft YaHei" w:eastAsia="Microsoft YaHei"/>
                 <w:sz w:val="18"/>
               </w:rPr>
-            </w:r>
-            <w:r>
-              <w:rPr>
-                <w:rFonts w:ascii="Microsoft YaHei" w:hAnsi="Microsoft YaHei" w:eastAsia="Microsoft YaHei"/>
-                <w:sz w:val="18"/>
-              </w:rPr>
-              <w:t>Godot 窗口</w:t>
+              <w:t>当前 Godot 窗口</w:t>
+            </w:r>
+            <w:r>
+              <w:rPr>
+                <w:rFonts w:ascii="Microsoft YaHei" w:hAnsi="Microsoft YaHei" w:eastAsia="Microsoft YaHei"/>
+                <w:sz w:val="18"/>
+              </w:rPr>
             </w:r>
           </w:p>
         </w:tc>
@@ -2460,13 +2460,13 @@
                 <w:rFonts w:ascii="Microsoft YaHei" w:hAnsi="Microsoft YaHei" w:eastAsia="Microsoft YaHei"/>
                 <w:sz w:val="18"/>
               </w:rPr>
-            </w:r>
-            <w:r>
-              <w:rPr>
-                <w:rFonts w:ascii="Microsoft YaHei" w:hAnsi="Microsoft YaHei" w:eastAsia="Microsoft YaHei"/>
-                <w:sz w:val="18"/>
-              </w:rPr>
-              <w:t>1080x1920</w:t>
+              <w:t>720x1280</w:t>
+            </w:r>
+            <w:r>
+              <w:rPr>
+                <w:rFonts w:ascii="Microsoft YaHei" w:hAnsi="Microsoft YaHei" w:eastAsia="Microsoft YaHei"/>
+                <w:sz w:val="18"/>
+              </w:rPr>
             </w:r>
           </w:p>
         </w:tc>
@@ -2490,6 +2490,7 @@
                 <w:rFonts w:ascii="Microsoft YaHei" w:hAnsi="Microsoft YaHei" w:eastAsia="Microsoft YaHei"/>
                 <w:sz w:val="18"/>
               </w:rPr>
+              <w:t>project.godot</w:t>
             </w:r>
             <w:r>
               <w:rPr>
@@ -2497,7 +2498,198 @@
                 <w:color w:val="1F4D78"/>
                 <w:sz w:val="18"/>
               </w:rPr>
-              <w:t>project.godot</w:t>
+            </w:r>
+          </w:p>
+        </w:tc>
+      </w:tr>
+      <w:tr>
+        <w:trPr>
+          <w:cantSplit w:val="true"/>
+        </w:trPr>
+        <w:tc>
+          <w:tcPr>
+            <w:tcW w:type="dxa" w:w="1593"/>
+            <w:tcMar>
+              <w:top w:w="80" w:type="dxa"/>
+              <w:bottom w:w="80" w:type="dxa"/>
+              <w:start w:w="120" w:type="dxa"/>
+              <w:end w:w="120" w:type="dxa"/>
+            </w:tcMar>
+            <w:vAlign w:val="center"/>
+          </w:tcPr>
+          <w:p>
+            <w:pPr>
+              <w:spacing w:before="0" w:after="0" w:line="276" w:lineRule="auto"/>
+            </w:pPr>
+            <w:r>
+              <w:rPr>
+                <w:rFonts w:ascii="Microsoft YaHei" w:hAnsi="Microsoft YaHei" w:eastAsia="Microsoft YaHei"/>
+                <w:sz w:val="18"/>
+              </w:rPr>
+              <w:t>横屏默认分辨率</w:t>
+            </w:r>
+            <w:r>
+              <w:rPr>
+                <w:rFonts w:ascii="Microsoft YaHei" w:hAnsi="Microsoft YaHei" w:eastAsia="Microsoft YaHei"/>
+                <w:sz w:val="18"/>
+              </w:rPr>
+            </w:r>
+          </w:p>
+        </w:tc>
+        <w:tc>
+          <w:tcPr>
+            <w:tcW w:type="dxa" w:w="3983"/>
+            <w:tcMar>
+              <w:top w:w="80" w:type="dxa"/>
+              <w:bottom w:w="80" w:type="dxa"/>
+              <w:start w:w="120" w:type="dxa"/>
+              <w:end w:w="120" w:type="dxa"/>
+            </w:tcMar>
+            <w:vAlign w:val="center"/>
+          </w:tcPr>
+          <w:p>
+            <w:pPr>
+              <w:spacing w:before="0" w:after="0" w:line="276" w:lineRule="auto"/>
+            </w:pPr>
+            <w:r>
+              <w:rPr>
+                <w:rFonts w:ascii="Microsoft YaHei" w:hAnsi="Microsoft YaHei" w:eastAsia="Microsoft YaHei"/>
+                <w:sz w:val="18"/>
+              </w:rPr>
+              <w:t>1280x720</w:t>
+            </w:r>
+            <w:r>
+              <w:rPr>
+                <w:rFonts w:ascii="Microsoft YaHei" w:hAnsi="Microsoft YaHei" w:eastAsia="Microsoft YaHei"/>
+                <w:sz w:val="18"/>
+              </w:rPr>
+            </w:r>
+          </w:p>
+        </w:tc>
+        <w:tc>
+          <w:tcPr>
+            <w:tcW w:type="dxa" w:w="3784"/>
+            <w:tcMar>
+              <w:top w:w="80" w:type="dxa"/>
+              <w:bottom w:w="80" w:type="dxa"/>
+              <w:start w:w="120" w:type="dxa"/>
+              <w:end w:w="120" w:type="dxa"/>
+            </w:tcMar>
+            <w:vAlign w:val="center"/>
+          </w:tcPr>
+          <w:p>
+            <w:pPr>
+              <w:spacing w:before="0" w:after="0" w:line="276" w:lineRule="auto"/>
+            </w:pPr>
+            <w:r>
+              <w:rPr>
+                <w:rFonts w:ascii="Microsoft YaHei" w:hAnsi="Microsoft YaHei" w:eastAsia="Microsoft YaHei"/>
+                <w:sz w:val="18"/>
+              </w:rPr>
+              <w:t>跨项目默认；当前项目固定竖屏</w:t>
+            </w:r>
+            <w:r>
+              <w:rPr>
+                <w:rFonts w:ascii="Microsoft YaHei" w:hAnsi="Microsoft YaHei" w:eastAsia="Microsoft YaHei"/>
+                <w:color w:val="1F4D78"/>
+                <w:sz w:val="18"/>
+              </w:rPr>
+            </w:r>
+          </w:p>
+        </w:tc>
+      </w:tr>
+      <w:tr>
+        <w:trPr>
+          <w:cantSplit w:val="true"/>
+        </w:trPr>
+        <w:tc>
+          <w:tcPr>
+            <w:tcW w:type="dxa" w:w="1593"/>
+            <w:tcMar>
+              <w:top w:w="80" w:type="dxa"/>
+              <w:bottom w:w="80" w:type="dxa"/>
+              <w:start w:w="120" w:type="dxa"/>
+              <w:end w:w="120" w:type="dxa"/>
+            </w:tcMar>
+            <w:vAlign w:val="center"/>
+          </w:tcPr>
+          <w:p>
+            <w:pPr>
+              <w:spacing w:before="0" w:after="0" w:line="276" w:lineRule="auto"/>
+            </w:pPr>
+            <w:r>
+              <w:rPr>
+                <w:rFonts w:ascii="Microsoft YaHei" w:hAnsi="Microsoft YaHei" w:eastAsia="Microsoft YaHei"/>
+                <w:sz w:val="18"/>
+              </w:rPr>
+              <w:t>分辨率权威</w:t>
+            </w:r>
+            <w:r>
+              <w:rPr>
+                <w:rFonts w:ascii="Microsoft YaHei" w:hAnsi="Microsoft YaHei" w:eastAsia="Microsoft YaHei"/>
+                <w:sz w:val="18"/>
+              </w:rPr>
+            </w:r>
+          </w:p>
+        </w:tc>
+        <w:tc>
+          <w:tcPr>
+            <w:tcW w:type="dxa" w:w="3983"/>
+            <w:tcMar>
+              <w:top w:w="80" w:type="dxa"/>
+              <w:bottom w:w="80" w:type="dxa"/>
+              <w:start w:w="120" w:type="dxa"/>
+              <w:end w:w="120" w:type="dxa"/>
+            </w:tcMar>
+            <w:vAlign w:val="center"/>
+          </w:tcPr>
+          <w:p>
+            <w:pPr>
+              <w:spacing w:before="0" w:after="0" w:line="276" w:lineRule="auto"/>
+            </w:pPr>
+            <w:r>
+              <w:rPr>
+                <w:rFonts w:ascii="Microsoft YaHei" w:hAnsi="Microsoft YaHei" w:eastAsia="Microsoft YaHei"/>
+                <w:sz w:val="18"/>
+              </w:rPr>
+              <w:t>2026-08-25 制作人决策</w:t>
+            </w:r>
+            <w:r>
+              <w:rPr>
+                <w:rFonts w:ascii="Microsoft YaHei" w:hAnsi="Microsoft YaHei" w:eastAsia="Microsoft YaHei"/>
+                <w:sz w:val="18"/>
+              </w:rPr>
+            </w:r>
+          </w:p>
+        </w:tc>
+        <w:tc>
+          <w:tcPr>
+            <w:tcW w:type="dxa" w:w="3784"/>
+            <w:tcMar>
+              <w:top w:w="80" w:type="dxa"/>
+              <w:bottom w:w="80" w:type="dxa"/>
+              <w:start w:w="120" w:type="dxa"/>
+              <w:end w:w="120" w:type="dxa"/>
+            </w:tcMar>
+            <w:vAlign w:val="center"/>
+          </w:tcPr>
+          <w:p>
+            <w:pPr>
+              <w:spacing w:before="0" w:after="0" w:line="276" w:lineRule="auto"/>
+            </w:pPr>
+            <w:r>
+              <w:rPr>
+                <w:rFonts w:ascii="Microsoft YaHei" w:hAnsi="Microsoft YaHei" w:eastAsia="Microsoft YaHei"/>
+                <w:sz w:val="18"/>
+              </w:rPr>
+              <w:t>取代旧 1080x1920 / 540x960 规则</w:t>
+            </w:r>
+            <w:r>
+              <w:rPr>
+                <w:rFonts w:ascii="Microsoft YaHei" w:hAnsi="Microsoft YaHei" w:eastAsia="Microsoft YaHei"/>
+                <w:color w:val="1F4D78"/>
+                <w:sz w:val="18"/>
+              </w:rPr>
             </w:r>
           </w:p>
         </w:tc>

</xml_diff>

<commit_message>
feat: add battle income feedback and retaliation
</commit_message>
<xml_diff>
--- a/docs/CURRENT_GAME_DESIGN.docx
+++ b/docs/CURRENT_GAME_DESIGN.docx
@@ -4043,10 +4043,7 @@
         </w:numPr>
       </w:pPr>
       <w:r>
-        <w:rPr>
-          <w:rFonts w:ascii="Microsoft YaHei" w:hAnsi="Microsoft YaHei" w:eastAsia="Microsoft YaHei"/>
-        </w:rPr>
-        <w:t>动物出生或当前推进建筑死亡、消失、转为盟友时，选择最近的敌方建筑并锁定为推进目标；寻路过程中不因出现新的动物或更近建筑而改道。动物只攻击自身攻击范围内的敌对动物或建筑，玩家拖动地图和查看地块不能改变其推进目标。</w:t>
+        <w:t>动物出生或当前推进建筑死亡、消失、转为盟友时，选择最近的敌方建筑并锁定为推进目标；寻路过程中不因出现新的动物或更近建筑而改道。动物只攻击自身攻击范围内的敌对动物或建筑。动物没有有效攻击目标且受到敌方单位或攻击建筑的实际伤害时，锁定伤害来源并追击至第一次反击；已有有效攻击目标时保持原目标。玩家拖动地图和查看地块不能改变上述目标。</w:t>
       </w:r>
     </w:p>
     <w:p>
@@ -7235,21 +7232,8 @@
             <w:vAlign w:val="center"/>
           </w:tcPr>
           <w:p>
-            <w:pPr>
-              <w:spacing w:before="0" w:after="0" w:line="276" w:lineRule="auto"/>
-            </w:pPr>
-            <w:r>
-              <w:rPr>
-                <w:rFonts w:ascii="Microsoft YaHei" w:hAnsi="Microsoft YaHei" w:eastAsia="Microsoft YaHei"/>
-                <w:sz w:val="18"/>
-              </w:rPr>
-            </w:r>
-            <w:r>
-              <w:rPr>
-                <w:rFonts w:ascii="Microsoft YaHei" w:hAnsi="Microsoft YaHei" w:eastAsia="Microsoft YaHei"/>
-                <w:sz w:val="18"/>
-              </w:rPr>
-              <w:t>初始可解锁金矿</w:t>
+            <w:r>
+              <w:t>金矿定额</w:t>
             </w:r>
           </w:p>
         </w:tc>
@@ -7265,21 +7249,8 @@
             <w:vAlign w:val="center"/>
           </w:tcPr>
           <w:p>
-            <w:pPr>
-              <w:spacing w:before="0" w:after="0" w:line="276" w:lineRule="auto"/>
-            </w:pPr>
-            <w:r>
-              <w:rPr>
-                <w:rFonts w:ascii="Microsoft YaHei" w:hAnsi="Microsoft YaHei" w:eastAsia="Microsoft YaHei"/>
-                <w:sz w:val="18"/>
-              </w:rPr>
-            </w:r>
-            <w:r>
-              <w:rPr>
-                <w:rFonts w:ascii="Microsoft YaHei" w:hAnsi="Microsoft YaHei" w:eastAsia="Microsoft YaHei"/>
-                <w:sz w:val="18"/>
-              </w:rPr>
-              <w:t>玩家大本营相邻可解锁地块中有且仅有 1 块金矿；敌方大本营相邻可解锁地块同样有且仅有 1 块金矿</w:t>
+            <w:r>
+              <w:t>每个势力有且仅有 1 块基地相邻起始金矿和 1 块非相邻额外金矿；额外金矿优先放入最靠近地图中心的合法圈，同圈种子打散并保持地图对称，整图固定 2 块</w:t>
             </w:r>
           </w:p>
         </w:tc>
@@ -9667,10 +9638,7 @@
         </w:numPr>
       </w:pPr>
       <w:r>
-        <w:rPr>
-          <w:rFonts w:ascii="Microsoft YaHei" w:hAnsi="Microsoft YaHei" w:eastAsia="Microsoft YaHei"/>
-        </w:rPr>
-        <w:t>动物营地/大厅的召唤进度条使用更短、更细的小条，并放在六边形内部偏上位置；建筑生命条同样收窄。战斗中的单位血条、建筑生命条和召唤进度条只保留一条底槽加填充，不额外绘制下方黑色阴影条。</w:t>
+        <w:t>动物营地/大厅的召唤进度条使用更短、更细的小条；基地与金矿用同类小条显示统一 3 秒金币生产进度。建筑生命条同样收窄。战斗中的单位血条、建筑生命条和生产进度条只保留一条底槽加填充，不额外绘制下方黑色阴影条。</w:t>
       </w:r>
     </w:p>
     <w:p>
@@ -10432,6 +10400,12 @@
       <w:pPr>
         <w:spacing w:after="0"/>
       </w:pPr>
+    </w:p>
+    <w:p>
+      <w:pPr/>
+      <w:r>
+        <w:t>基地与金矿共用当前 3 秒收入计时。每座有效基地和金矿都在建筑下方显示由空到满的紧凑生产进度条；周期完成时按建筑逐座结算，并在对应建筑上方播放金币图标与 +12 或 +10 上浮淡出动效。该显示只拆分反馈来源，不改变总收入、计时周期或淘汰队伍不再结算的规则。</w:t>
+      </w:r>
     </w:p>
     <w:p>
       <w:r>
@@ -11684,24 +11658,7 @@
         </w:numPr>
       </w:pPr>
       <w:r>
-        <w:rPr>
-          <w:rFonts w:ascii="Microsoft YaHei" w:hAnsi="Microsoft YaHei" w:eastAsia="Microsoft YaHei"/>
-        </w:rPr>
-        <w:t xml:space="preserve">动物触发金币效果时，在该动物头顶显示金币图标与 </w:t>
-      </w:r>
-      <w:r>
-        <w:rPr>
-          <w:rFonts w:ascii="Consolas" w:hAnsi="Consolas" w:eastAsia="Consolas"/>
-          <w:color w:val="1F4D78"/>
-          <w:sz w:val="19"/>
-        </w:rPr>
-        <w:t>+数量</w:t>
-      </w:r>
-      <w:r>
-        <w:rPr>
-          <w:rFonts w:ascii="Microsoft YaHei" w:hAnsi="Microsoft YaHei" w:eastAsia="Microsoft YaHei"/>
-        </w:rPr>
-        <w:t>，短暂上浮并淡出；同一动物在极短时间内连续触发时合并数字，避免大量单位同时产金造成信息噪音。基地与金矿的周期基础收入不生成飘字。</w:t>
+        <w:t>动物触发金币效果时，在该动物头顶显示金币图标与 +数量，短暂上浮并淡出；同一动物在极短时间内连续触发时合并数字，避免大量单位同时产金造成信息噪音。基地与金矿周期完成时也在各自建筑上方显示同类动效，但按单座建筑分别显示对应基础收入。</w:t>
       </w:r>
     </w:p>
     <w:p>
@@ -11821,10 +11778,7 @@
         </w:numPr>
       </w:pPr>
       <w:r>
-        <w:rPr>
-          <w:rFonts w:ascii="Microsoft YaHei" w:hAnsi="Microsoft YaHei" w:eastAsia="Microsoft YaHei"/>
-        </w:rPr>
-        <w:t>每次更新只扫描攻击范围内的敌对动物和建筑作为即时攻击候选，不使用范围外候选改变推进路径。</w:t>
+        <w:t>没有有效攻击锁定时，才扫描攻击范围内的敌对动物和建筑并保存稳定锁定；普通范围外候选不能改变推进路径。</w:t>
       </w:r>
     </w:p>
     <w:p>
@@ -11836,10 +11790,7 @@
         </w:numPr>
       </w:pPr>
       <w:r>
-        <w:rPr>
-          <w:rFonts w:ascii="Microsoft YaHei" w:hAnsi="Microsoft YaHei" w:eastAsia="Microsoft YaHei"/>
-        </w:rPr>
-        <w:t>如果范围内存在攻击目标，按冷却造成伤害；否则继续沿缓存路径向锁定建筑推进。</w:t>
+        <w:t>当前攻击目标仍存活、仍敌对且仍在射程内时持续攻击同一目标；目标死亡、关系失效或离开射程时才释放。没有攻击目标且受击时，临时锁定实际伤害来源并追击至第一次反击；受击前已有有效目标则不变。</w:t>
       </w:r>
     </w:p>
     <w:p>
@@ -11866,10 +11817,7 @@
         </w:numPr>
       </w:pPr>
       <w:r>
-        <w:rPr>
-          <w:rFonts w:ascii="Microsoft YaHei" w:hAnsi="Microsoft YaHei" w:eastAsia="Microsoft YaHei"/>
-        </w:rPr>
-        <w:t>不追逐攻击范围外的动物，也不因途中出现更近建筑而重新寻路。</w:t>
+        <w:t>除受击后的首次反击例外外，不追逐攻击范围外的动物，也不因途中出现更近建筑而重新寻路；首次反击后立即恢复普通射程锁定。</w:t>
       </w:r>
     </w:p>
     <w:p>
@@ -13916,10 +13864,7 @@
         </w:numPr>
       </w:pPr>
       <w:r>
-        <w:rPr>
-          <w:rFonts w:ascii="Microsoft YaHei" w:hAnsi="Microsoft YaHei" w:eastAsia="Microsoft YaHei"/>
-        </w:rPr>
-        <w:t>每个基地保底 1 个相邻金矿和 1 个 50 金币营地；每名玩家的初始领地连通，整张地图也必须连通。</w:t>
+        <w:t>每个基地有且仅有 1 个相邻起始金矿和 1 个 50 金币营地；每名玩家另有 1 个不与基地相邻的额外金矿。额外金矿位于全部合法候选中最靠近地图中心的六边格距离圈，同圈由布局种子稳定打散，并保持镜像或六重旋转对称。每名玩家的初始领地连通，整张地图也必须连通。</w:t>
       </w:r>
     </w:p>
     <w:p>
@@ -16206,20 +16151,7 @@
             <w:vAlign w:val="center"/>
           </w:tcPr>
           <w:p>
-            <w:pPr>
-              <w:spacing w:before="0" w:after="0" w:line="276" w:lineRule="auto"/>
-            </w:pPr>
-            <w:r>
-              <w:rPr>
-                <w:rFonts w:ascii="Microsoft YaHei" w:hAnsi="Microsoft YaHei" w:eastAsia="Microsoft YaHei"/>
-                <w:sz w:val="18"/>
-              </w:rPr>
-            </w:r>
-            <w:r>
-              <w:rPr>
-                <w:rFonts w:ascii="Microsoft YaHei" w:hAnsi="Microsoft YaHei" w:eastAsia="Microsoft YaHei"/>
-                <w:sz w:val="18"/>
-              </w:rPr>
+            <w:r>
               <w:t>cell_gold_mine</w:t>
             </w:r>
           </w:p>
@@ -16236,20 +16168,7 @@
             <w:vAlign w:val="center"/>
           </w:tcPr>
           <w:p>
-            <w:pPr>
-              <w:spacing w:before="0" w:after="0" w:line="276" w:lineRule="auto"/>
-            </w:pPr>
-            <w:r>
-              <w:rPr>
-                <w:rFonts w:ascii="Microsoft YaHei" w:hAnsi="Microsoft YaHei" w:eastAsia="Microsoft YaHei"/>
-                <w:sz w:val="18"/>
-              </w:rPr>
-            </w:r>
-            <w:r>
-              <w:rPr>
-                <w:rFonts w:ascii="Microsoft YaHei" w:hAnsi="Microsoft YaHei" w:eastAsia="Microsoft YaHei"/>
-                <w:sz w:val="18"/>
-              </w:rPr>
+            <w:r>
               <w:t>gold_mine</w:t>
             </w:r>
           </w:p>
@@ -16266,20 +16185,7 @@
             <w:vAlign w:val="center"/>
           </w:tcPr>
           <w:p>
-            <w:pPr>
-              <w:spacing w:before="0" w:after="0" w:line="276" w:lineRule="auto"/>
-            </w:pPr>
-            <w:r>
-              <w:rPr>
-                <w:rFonts w:ascii="Microsoft YaHei" w:hAnsi="Microsoft YaHei" w:eastAsia="Microsoft YaHei"/>
-                <w:sz w:val="18"/>
-              </w:rPr>
-            </w:r>
-            <w:r>
-              <w:rPr>
-                <w:rFonts w:ascii="Microsoft YaHei" w:hAnsi="Microsoft YaHei" w:eastAsia="Microsoft YaHei"/>
-                <w:sz w:val="18"/>
-              </w:rPr>
+            <w:r>
               <w:t>fixed</w:t>
             </w:r>
           </w:p>
@@ -16296,20 +16202,7 @@
             <w:vAlign w:val="center"/>
           </w:tcPr>
           <w:p>
-            <w:pPr>
-              <w:spacing w:before="0" w:after="0" w:line="276" w:lineRule="auto"/>
-            </w:pPr>
-            <w:r>
-              <w:rPr>
-                <w:rFonts w:ascii="Microsoft YaHei" w:hAnsi="Microsoft YaHei" w:eastAsia="Microsoft YaHei"/>
-                <w:sz w:val="18"/>
-              </w:rPr>
-            </w:r>
-            <w:r>
-              <w:rPr>
-                <w:rFonts w:ascii="Microsoft YaHei" w:hAnsi="Microsoft YaHei" w:eastAsia="Microsoft YaHei"/>
-                <w:sz w:val="18"/>
-              </w:rPr>
+            <w:r>
               <w:t>50</w:t>
             </w:r>
           </w:p>
@@ -16326,20 +16219,7 @@
             <w:vAlign w:val="center"/>
           </w:tcPr>
           <w:p>
-            <w:pPr>
-              <w:spacing w:before="0" w:after="0" w:line="276" w:lineRule="auto"/>
-            </w:pPr>
-            <w:r>
-              <w:rPr>
-                <w:rFonts w:ascii="Microsoft YaHei" w:hAnsi="Microsoft YaHei" w:eastAsia="Microsoft YaHei"/>
-                <w:sz w:val="18"/>
-              </w:rPr>
-            </w:r>
-            <w:r>
-              <w:rPr>
-                <w:rFonts w:ascii="Microsoft YaHei" w:hAnsi="Microsoft YaHei" w:eastAsia="Microsoft YaHei"/>
-                <w:sz w:val="18"/>
-              </w:rPr>
+            <w:r>
               <w:t>10 金币 / 3 秒</w:t>
             </w:r>
           </w:p>
@@ -16356,21 +16236,8 @@
             <w:vAlign w:val="center"/>
           </w:tcPr>
           <w:p>
-            <w:pPr>
-              <w:spacing w:before="0" w:after="0" w:line="276" w:lineRule="auto"/>
-            </w:pPr>
-            <w:r>
-              <w:rPr>
-                <w:rFonts w:ascii="Microsoft YaHei" w:hAnsi="Microsoft YaHei" w:eastAsia="Microsoft YaHei"/>
-                <w:sz w:val="18"/>
-              </w:rPr>
-            </w:r>
-            <w:r>
-              <w:rPr>
-                <w:rFonts w:ascii="Microsoft YaHei" w:hAnsi="Microsoft YaHei" w:eastAsia="Microsoft YaHei"/>
-                <w:sz w:val="18"/>
-              </w:rPr>
-              <w:t>5%</w:t>
+            <w:r>
+              <w:t>0%</w:t>
             </w:r>
           </w:p>
         </w:tc>
@@ -16386,21 +16253,8 @@
             <w:vAlign w:val="center"/>
           </w:tcPr>
           <w:p>
-            <w:pPr>
-              <w:spacing w:before="0" w:after="0" w:line="276" w:lineRule="auto"/>
-            </w:pPr>
-            <w:r>
-              <w:rPr>
-                <w:rFonts w:ascii="Microsoft YaHei" w:hAnsi="Microsoft YaHei" w:eastAsia="Microsoft YaHei"/>
-                <w:sz w:val="18"/>
-              </w:rPr>
-            </w:r>
-            <w:r>
-              <w:rPr>
-                <w:rFonts w:ascii="Microsoft YaHei" w:hAnsi="Microsoft YaHei" w:eastAsia="Microsoft YaHei"/>
-                <w:sz w:val="18"/>
-              </w:rPr>
-              <w:t>非常稀有的固定金矿；双方初始可解锁地块各保底且仅保底 1 块</w:t>
+            <w:r>
+              <w:t>不参与普通地块随机池；固定 1 块基地相邻矿和 1 块最靠近地图中心合法圈的非相邻矿；显示生产进度与结算动效</w:t>
             </w:r>
           </w:p>
         </w:tc>
@@ -16421,20 +16275,7 @@
             <w:vAlign w:val="center"/>
           </w:tcPr>
           <w:p>
-            <w:pPr>
-              <w:spacing w:before="0" w:after="0" w:line="276" w:lineRule="auto"/>
-            </w:pPr>
-            <w:r>
-              <w:rPr>
-                <w:rFonts w:ascii="Microsoft YaHei" w:hAnsi="Microsoft YaHei" w:eastAsia="Microsoft YaHei"/>
-                <w:sz w:val="18"/>
-              </w:rPr>
-            </w:r>
-            <w:r>
-              <w:rPr>
-                <w:rFonts w:ascii="Microsoft YaHei" w:hAnsi="Microsoft YaHei" w:eastAsia="Microsoft YaHei"/>
-                <w:sz w:val="18"/>
-              </w:rPr>
+            <w:r>
               <w:t>cell_home_base</w:t>
             </w:r>
           </w:p>
@@ -16451,20 +16292,7 @@
             <w:vAlign w:val="center"/>
           </w:tcPr>
           <w:p>
-            <w:pPr>
-              <w:spacing w:before="0" w:after="0" w:line="276" w:lineRule="auto"/>
-            </w:pPr>
-            <w:r>
-              <w:rPr>
-                <w:rFonts w:ascii="Microsoft YaHei" w:hAnsi="Microsoft YaHei" w:eastAsia="Microsoft YaHei"/>
-                <w:sz w:val="18"/>
-              </w:rPr>
-            </w:r>
-            <w:r>
-              <w:rPr>
-                <w:rFonts w:ascii="Microsoft YaHei" w:hAnsi="Microsoft YaHei" w:eastAsia="Microsoft YaHei"/>
-                <w:sz w:val="18"/>
-              </w:rPr>
+            <w:r>
               <w:t>home_base</w:t>
             </w:r>
           </w:p>
@@ -16481,20 +16309,7 @@
             <w:vAlign w:val="center"/>
           </w:tcPr>
           <w:p>
-            <w:pPr>
-              <w:spacing w:before="0" w:after="0" w:line="276" w:lineRule="auto"/>
-            </w:pPr>
-            <w:r>
-              <w:rPr>
-                <w:rFonts w:ascii="Microsoft YaHei" w:hAnsi="Microsoft YaHei" w:eastAsia="Microsoft YaHei"/>
-                <w:sz w:val="18"/>
-              </w:rPr>
-            </w:r>
-            <w:r>
-              <w:rPr>
-                <w:rFonts w:ascii="Microsoft YaHei" w:hAnsi="Microsoft YaHei" w:eastAsia="Microsoft YaHei"/>
-                <w:sz w:val="18"/>
-              </w:rPr>
+            <w:r>
               <w:t>free</w:t>
             </w:r>
           </w:p>
@@ -16511,20 +16326,7 @@
             <w:vAlign w:val="center"/>
           </w:tcPr>
           <w:p>
-            <w:pPr>
-              <w:spacing w:before="0" w:after="0" w:line="276" w:lineRule="auto"/>
-            </w:pPr>
-            <w:r>
-              <w:rPr>
-                <w:rFonts w:ascii="Microsoft YaHei" w:hAnsi="Microsoft YaHei" w:eastAsia="Microsoft YaHei"/>
-                <w:sz w:val="18"/>
-              </w:rPr>
-            </w:r>
-            <w:r>
-              <w:rPr>
-                <w:rFonts w:ascii="Microsoft YaHei" w:hAnsi="Microsoft YaHei" w:eastAsia="Microsoft YaHei"/>
-                <w:sz w:val="18"/>
-              </w:rPr>
+            <w:r>
               <w:t>0</w:t>
             </w:r>
           </w:p>
@@ -16541,20 +16343,7 @@
             <w:vAlign w:val="center"/>
           </w:tcPr>
           <w:p>
-            <w:pPr>
-              <w:spacing w:before="0" w:after="0" w:line="276" w:lineRule="auto"/>
-            </w:pPr>
-            <w:r>
-              <w:rPr>
-                <w:rFonts w:ascii="Microsoft YaHei" w:hAnsi="Microsoft YaHei" w:eastAsia="Microsoft YaHei"/>
-                <w:sz w:val="18"/>
-              </w:rPr>
-            </w:r>
-            <w:r>
-              <w:rPr>
-                <w:rFonts w:ascii="Microsoft YaHei" w:hAnsi="Microsoft YaHei" w:eastAsia="Microsoft YaHei"/>
-                <w:sz w:val="18"/>
-              </w:rPr>
+            <w:r>
               <w:t>12 金币 / 3 秒</w:t>
             </w:r>
           </w:p>
@@ -16571,20 +16360,7 @@
             <w:vAlign w:val="center"/>
           </w:tcPr>
           <w:p>
-            <w:pPr>
-              <w:spacing w:before="0" w:after="0" w:line="276" w:lineRule="auto"/>
-            </w:pPr>
-            <w:r>
-              <w:rPr>
-                <w:rFonts w:ascii="Microsoft YaHei" w:hAnsi="Microsoft YaHei" w:eastAsia="Microsoft YaHei"/>
-                <w:sz w:val="18"/>
-              </w:rPr>
-            </w:r>
-            <w:r>
-              <w:rPr>
-                <w:rFonts w:ascii="Microsoft YaHei" w:hAnsi="Microsoft YaHei" w:eastAsia="Microsoft YaHei"/>
-                <w:sz w:val="18"/>
-              </w:rPr>
+            <w:r>
               <w:t>0%</w:t>
             </w:r>
           </w:p>
@@ -16601,21 +16377,8 @@
             <w:vAlign w:val="center"/>
           </w:tcPr>
           <w:p>
-            <w:pPr>
-              <w:spacing w:before="0" w:after="0" w:line="276" w:lineRule="auto"/>
-            </w:pPr>
-            <w:r>
-              <w:rPr>
-                <w:rFonts w:ascii="Microsoft YaHei" w:hAnsi="Microsoft YaHei" w:eastAsia="Microsoft YaHei"/>
-                <w:sz w:val="18"/>
-              </w:rPr>
-            </w:r>
-            <w:r>
-              <w:rPr>
-                <w:rFonts w:ascii="Microsoft YaHei" w:hAnsi="Microsoft YaHei" w:eastAsia="Microsoft YaHei"/>
-                <w:sz w:val="18"/>
-              </w:rPr>
-              <w:t>固定基地，不参与随机</w:t>
+            <w:r>
+              <w:t>固定基地，不参与随机；显示生产进度与结算动效</w:t>
             </w:r>
           </w:p>
         </w:tc>
@@ -25588,6 +25351,110 @@
       </w:pPr>
       <w:r>
         <w:t>卡牌详情、战斗召唤、单人 AI、多人玩家卡组与 AI 镜像必须通过同一 CardRules.card_stats 公式取值，禁止另设旁路。</w:t>
+      </w:r>
+    </w:p>
+    <w:p>
+      <w:pPr>
+        <w:pStyle w:val="Heading1"/>
+      </w:pPr>
+      <w:r>
+        <w:t>16. 2026-08-25 金币反馈、受击反击与中心金矿修订</w:t>
+      </w:r>
+    </w:p>
+    <w:p>
+      <w:pPr>
+        <w:pStyle w:val="Heading2"/>
+      </w:pPr>
+      <w:r>
+        <w:t>16.1 基地与金矿生产反馈</w:t>
+      </w:r>
+    </w:p>
+    <w:p>
+      <w:pPr>
+        <w:pStyle w:val="ListBullet"/>
+      </w:pPr>
+      <w:r>
+        <w:t>基地和金矿继续共用 3 秒收入周期，每座建筑显示同类紧凑生产进度条。</w:t>
+      </w:r>
+    </w:p>
+    <w:p>
+      <w:pPr>
+        <w:pStyle w:val="ListBullet"/>
+      </w:pPr>
+      <w:r>
+        <w:t>每次周期完成后逐建筑结算：基地 +12、金矿 +10；每座建筑上方分别播放金币图标与对应 +数值上浮淡出动效，总收入不变。</w:t>
+      </w:r>
+    </w:p>
+    <w:p>
+      <w:pPr>
+        <w:pStyle w:val="ListBullet"/>
+      </w:pPr>
+      <w:r>
+        <w:t>进度和动效属于世界内反馈，不改变建筑生命、攻击、收入配置、多人队伍独立金币或淘汰判定。</w:t>
+      </w:r>
+    </w:p>
+    <w:p>
+      <w:pPr>
+        <w:pStyle w:val="Heading2"/>
+      </w:pPr>
+      <w:r>
+        <w:t>16.2 移动受击反击</w:t>
+      </w:r>
+    </w:p>
+    <w:p>
+      <w:pPr>
+        <w:pStyle w:val="ListBullet"/>
+      </w:pPr>
+      <w:r>
+        <w:t>动物没有有效攻击目标且受到敌方单位、基地或防御塔的实际伤害时，锁定实际伤害来源并向其移动，直到进入射程完成第一次反击。</w:t>
+      </w:r>
+    </w:p>
+    <w:p>
+      <w:pPr>
+        <w:pStyle w:val="ListBullet"/>
+      </w:pPr>
+      <w:r>
+        <w:t>受击时已有仍存活、仍敌对且仍有效的攻击目标，则保持原目标，不被后来的攻击者抢走。</w:t>
+      </w:r>
+    </w:p>
+    <w:p>
+      <w:pPr>
+        <w:pStyle w:val="ListBullet"/>
+      </w:pPr>
+      <w:r>
+        <w:t>第一次反击后取消临时追击例外；后续按普通锁敌规则，在目标死亡、关系失效或离开射程时释放并重新选择。</w:t>
+      </w:r>
+    </w:p>
+    <w:p>
+      <w:pPr>
+        <w:pStyle w:val="Heading2"/>
+      </w:pPr>
+      <w:r>
+        <w:t>16.3 额外金矿中心圈</w:t>
+      </w:r>
+    </w:p>
+    <w:p>
+      <w:pPr>
+        <w:pStyle w:val="ListBullet"/>
+      </w:pPr>
+      <w:r>
+        <w:t>每名玩家仍固定拥有 1 个基地相邻起始金矿和 1 个非相邻额外金矿，不增减经济配额。</w:t>
+      </w:r>
+    </w:p>
+    <w:p>
+      <w:pPr>
+        <w:pStyle w:val="ListBullet"/>
+      </w:pPr>
+      <w:r>
+        <w:t>额外金矿优先选择本方全部合法候选中六边格中心距离最小的圈，同圈再由布局种子稳定打散。</w:t>
+      </w:r>
+    </w:p>
+    <w:p>
+      <w:pPr>
+        <w:pStyle w:val="ListBullet"/>
+      </w:pPr>
+      <w:r>
+        <w:t>1V1/2V2 保持镜像，3V3 与自由混战保持六重旋转；额外金矿不能落在基地相邻圈，因此开局不能直接解锁两座金矿。</w:t>
       </w:r>
     </w:p>
     <w:sectPr>

</xml_diff>

<commit_message>
fix: gate idle retaliation on a one-hex distance advantage
</commit_message>
<xml_diff>
--- a/docs/CURRENT_GAME_DESIGN.docx
+++ b/docs/CURRENT_GAME_DESIGN.docx
@@ -16,7 +16,7 @@
     </w:p>
     <w:p>
       <w:r>
-        <w:t>更新日期：2026-08-25</w:t>
+        <w:t>更新日期：2026-09-06</w:t>
       </w:r>
     </w:p>
     <w:p>
@@ -1065,6 +1065,7 @@
           </w:tcPr>
           <w:p>
             <w:pPr>
+              <w:keepNext/>
               <w:spacing w:before="0" w:after="0" w:line="276" w:lineRule="auto"/>
             </w:pPr>
             <w:r>
@@ -1098,6 +1099,7 @@
           </w:tcPr>
           <w:p>
             <w:pPr>
+              <w:keepNext/>
               <w:spacing w:before="0" w:after="0" w:line="276" w:lineRule="auto"/>
             </w:pPr>
             <w:r>
@@ -1131,6 +1133,7 @@
           </w:tcPr>
           <w:p>
             <w:pPr>
+              <w:keepNext/>
               <w:spacing w:before="0" w:after="0" w:line="276" w:lineRule="auto"/>
             </w:pPr>
             <w:r>
@@ -4043,7 +4046,7 @@
         </w:numPr>
       </w:pPr>
       <w:r>
-        <w:t>动物出生或当前推进建筑死亡、消失、转为盟友时，选择最近的敌方建筑并锁定为推进目标；寻路过程中不因出现新的动物或更近建筑而改道。动物只攻击自身攻击范围内的敌对动物或建筑。动物没有有效攻击目标且受到敌方单位或攻击建筑的实际伤害时，锁定伤害来源并追击至第一次反击；已有有效攻击目标时保持原目标。玩家拖动地图和查看地块不能改变上述目标。</w:t>
+        <w:t>动物出生或当前推进建筑死亡、消失、转为盟友时，选择最近的敌方建筑并锁定为推进目标；寻路过程中不因出现新的动物或更近建筑而改道。动物只攻击自身攻击范围内的敌对动物或建筑。2026-09-06 修订：受击时，只有未在射程内交战、且当前索敌目标比攻击者远超过 1 格，才转火追击实际伤害来源至第一次反击；无有效目标时保留直接反击。玩家拖动地图和查看地块不能改变上述目标。</w:t>
       </w:r>
     </w:p>
     <w:p>
@@ -10986,6 +10989,9 @@
       </w:pPr>
     </w:p>
     <w:p>
+      <w:pPr>
+        <w:keepNext/>
+      </w:pPr>
       <w:r>
         <w:rPr>
           <w:rFonts w:ascii="Microsoft YaHei" w:hAnsi="Microsoft YaHei" w:eastAsia="Microsoft YaHei"/>
@@ -11790,7 +11796,7 @@
         </w:numPr>
       </w:pPr>
       <w:r>
-        <w:t>当前攻击目标仍存活、仍敌对且仍在射程内时持续攻击同一目标；目标死亡、关系失效或离开射程时才释放。没有攻击目标且受击时，临时锁定实际伤害来源并追击至第一次反击；受击前已有有效目标则不变。</w:t>
+        <w:t>当前攻击目标仍存活、仍敌对且仍在射程内时持续攻击同一目标，包括攻击冷却期间；目标死亡、关系失效或离开射程时才释放。未在射程内交战且受击时，仅当当前索敌目标比实际伤害来源远超过 1 格，才临时锁定来源并追击至第一次反击；无有效索敌目标时直接反击。</w:t>
       </w:r>
     </w:p>
     <w:p>
@@ -25356,6 +25362,7 @@
     <w:p>
       <w:pPr>
         <w:pStyle w:val="Heading1"/>
+        <w:spacing w:after="80" w:before="160" w:line="276" w:lineRule="auto"/>
       </w:pPr>
       <w:r>
         <w:t>16. 2026-08-25 金币反馈、受击反击与中心金矿修订</w:t>
@@ -25364,6 +25371,7 @@
     <w:p>
       <w:pPr>
         <w:pStyle w:val="Heading2"/>
+        <w:spacing w:after="80" w:before="160" w:line="276" w:lineRule="auto"/>
       </w:pPr>
       <w:r>
         <w:t>16.1 基地与金矿生产反馈</w:t>
@@ -25372,6 +25380,7 @@
     <w:p>
       <w:pPr>
         <w:pStyle w:val="ListBullet"/>
+        <w:spacing w:after="80" w:line="276" w:lineRule="auto"/>
       </w:pPr>
       <w:r>
         <w:t>基地和金矿继续共用 3 秒收入周期，每座建筑显示同类紧凑生产进度条。</w:t>
@@ -25380,6 +25389,7 @@
     <w:p>
       <w:pPr>
         <w:pStyle w:val="ListBullet"/>
+        <w:spacing w:after="80" w:line="276" w:lineRule="auto"/>
       </w:pPr>
       <w:r>
         <w:t>每次周期完成后逐建筑结算：基地 +12、金矿 +10；每座建筑上方分别播放金币图标与对应 +数值上浮淡出动效，总收入不变。</w:t>
@@ -25388,6 +25398,7 @@
     <w:p>
       <w:pPr>
         <w:pStyle w:val="ListBullet"/>
+        <w:spacing w:after="80" w:line="276" w:lineRule="auto"/>
       </w:pPr>
       <w:r>
         <w:t>进度和动效属于世界内反馈，不改变建筑生命、攻击、收入配置、多人队伍独立金币或淘汰判定。</w:t>
@@ -25396,6 +25407,7 @@
     <w:p>
       <w:pPr>
         <w:pStyle w:val="Heading2"/>
+        <w:spacing w:after="80" w:before="160" w:line="276" w:lineRule="auto"/>
       </w:pPr>
       <w:r>
         <w:t>16.2 移动受击反击</w:t>
@@ -25404,22 +25416,25 @@
     <w:p>
       <w:pPr>
         <w:pStyle w:val="ListBullet"/>
+        <w:spacing w:after="80" w:line="276" w:lineRule="auto"/>
       </w:pPr>
       <w:r>
-        <w:t>动物没有有效攻击目标且受到敌方单位、基地或防御塔的实际伤害时，锁定实际伤害来源并向其移动，直到进入射程完成第一次反击。</w:t>
+        <w:t>2026-09-06 修订：动物受到存活敌方单位、基地或防御塔的实际生命伤害时，若未在攻击状态，且当前索敌目标比攻击者远超过 1 格，则转火并追击攻击者至第一次反击。无有效索敌目标时仍直接反击。</w:t>
       </w:r>
     </w:p>
     <w:p>
       <w:pPr>
         <w:pStyle w:val="ListBullet"/>
+        <w:spacing w:after="80" w:line="276" w:lineRule="auto"/>
       </w:pPr>
       <w:r>
-        <w:t>受击时已有仍存活、仍敌对且仍有效的攻击目标，则保持原目标，不被后来的攻击者抢走。</w:t>
+        <w:t>范围内已有存活敌对攻击目标即视为攻击状态，包括攻击冷却等待，受击也不换目标。未交战时，当前索敌目标优先取有效的范围外反击追击目标，否则取有效推进建筑。比较受击瞬间双方世界直线距离，差值严格大于 1 格才转火；恰好 1 格及以下不转火。1 格为相邻六边格中心距离，即 sqrt(3) × HEX_SIZE，当前约 74.478 世界单位，不改现有塔射程换算。</w:t>
       </w:r>
     </w:p>
     <w:p>
       <w:pPr>
         <w:pStyle w:val="ListBullet"/>
+        <w:spacing w:after="80" w:line="276" w:lineRule="auto"/>
       </w:pPr>
       <w:r>
         <w:t>第一次反击后取消临时追击例外；后续按普通锁敌规则，在目标死亡、关系失效或离开射程时释放并重新选择。</w:t>
@@ -25428,6 +25443,7 @@
     <w:p>
       <w:pPr>
         <w:pStyle w:val="Heading2"/>
+        <w:spacing w:after="80" w:before="160" w:line="276" w:lineRule="auto"/>
       </w:pPr>
       <w:r>
         <w:t>16.3 额外金矿中心圈</w:t>
@@ -25436,6 +25452,7 @@
     <w:p>
       <w:pPr>
         <w:pStyle w:val="ListBullet"/>
+        <w:spacing w:after="80" w:line="276" w:lineRule="auto"/>
       </w:pPr>
       <w:r>
         <w:t>每名玩家仍固定拥有 1 个基地相邻起始金矿和 1 个非相邻额外金矿，不增减经济配额。</w:t>
@@ -25444,6 +25461,7 @@
     <w:p>
       <w:pPr>
         <w:pStyle w:val="ListBullet"/>
+        <w:spacing w:after="80" w:line="276" w:lineRule="auto"/>
       </w:pPr>
       <w:r>
         <w:t>额外金矿优先选择本方全部合法候选中六边格中心距离最小的圈，同圈再由布局种子稳定打散。</w:t>
@@ -25452,6 +25470,7 @@
     <w:p>
       <w:pPr>
         <w:pStyle w:val="ListBullet"/>
+        <w:spacing w:after="80" w:line="276" w:lineRule="auto"/>
       </w:pPr>
       <w:r>
         <w:t>1V1/2V2 保持镜像，3V3 与自由混战保持六重旋转；额外金矿不能落在基地相邻圈，因此开局不能直接解锁两座金矿。</w:t>

</xml_diff>